<commit_message>
v141: §4.2 Supreme Court selection redesigned (Triad replaced with open-candidacy MA Director model — Judicial Selection Board by lottery, RCV election, sitting Court removed from succession); §2.9.a judicial clemency review removed; scenario-rule-violation.html removed (editorial policy); scenario-formation.html and scenario-clemency.html added (29 scenarios); Triad references cleared site-wide (12 files); full voter and convention ready audit passed; 327 annotated provisions
</commit_message>
<xml_diff>
--- a/constitution-v140.docx
+++ b/constitution-v140.docx
@@ -3115,32 +3115,6 @@
           <w:sz w:val="22"/>
           <w:szCs w:val="22"/>
         </w:rPr>
-        <w:t xml:space="preserve">2.9.a Judicial Review of Grants: </w:t>
-      </w:r>
-      <w:r>
-        <w:rPr>
-          <w:rFonts w:ascii="Times New Roman" w:cs="Times New Roman" w:eastAsia="Times New Roman" w:hAnsi="Times New Roman"/>
-          <w:color w:val="000000"/>
-          <w:sz w:val="22"/>
-          <w:szCs w:val="22"/>
-        </w:rPr>
-        <w:t xml:space="preserve">Any clemency grant may be challenged before the Supreme Court within 30 days by any person with a concrete injury, on grounds of: violation of the conduct-exclusion grounds; violation of the co-conspirator or official-misconduct exclusion; or violation of §1.8 equal protection. The Court reviews constitutional compliance only — not the merits of the decision. A grant found unconstitutional is void and the original sentence reinstated.</w:t>
-      </w:r>
-    </w:p>
-    <w:p>
-      <w:pPr>
-        <w:spacing w:after="60" w:before="60" w:line="280" w:lineRule="auto"/>
-        <w:jc w:val="both"/>
-      </w:pPr>
-      <w:r>
-        <w:rPr>
-          <w:rFonts w:ascii="Times New Roman" w:cs="Times New Roman" w:eastAsia="Times New Roman" w:hAnsi="Times New Roman"/>
-          <w:b/>
-          <w:bCs/>
-          <w:color w:val="1B2A4A"/>
-          <w:sz w:val="22"/>
-          <w:szCs w:val="22"/>
-        </w:rPr>
         <w:t xml:space="preserve">2.9.b Legislative Amnesty: </w:t>
       </w:r>
       <w:r>
@@ -3202,7 +3176,7 @@
           <w:sz w:val="22"/>
           <w:szCs w:val="22"/>
         </w:rPr>
-        <w:t xml:space="preserve">Every clemency grant — whether by the President under §2.1.g or by the Prime Minister under §2.2.f — is subject to cross-chamber legislative review. Senate reviews PM clemency grants. The House reviews Presidential clemency grants. Within 7 days of any grant, the granting executive files a written explanatory report with the Executive Inspectorate stating: the identity of the recipient, the nature of the offense pardoned, the grounds for the grant, and any relevant circumstances the executive considered. The EI reviews the report for factual accuracy and completeness within 14 days and publishes its findings to the National Record System. The reviewing chamber then has 45 days from the date of EI publication to vote to disapprove the grant by simple majority of those present and voting. If no disapproval vote is held within the 45-day period, the grant is deemed approved and takes full effect. If the reviewing chamber votes to disapprove by simple majority within the 45-day period, the grant is void and the original sentence or legal status is reinstated. Where a grant is voided by disapproval, the executive may not resubmit clemency for the same recipient for one year from the date of the disapproval vote. The EI pre-grant factual background report required under §2.1.g and §2.2.f is distinct from the executive's post-grant explanatory report required by this provision — both are published to the National Record System and together form the complete clemency record for any grant. The reviewing chamber's 45-day period runs concurrently with any judicial review period under §2.9.a.</w:t>
+        <w:t>Every clemency grant — whether by the President under §2.1.g or by the Prime Minister under §2.2.f — is subject to cross-chamber legislative review. Senate reviews PM clemency grants. The House reviews Presidential clemency grants. Within 7 days of any grant, the granting executive files a written explanatory report with the Executive Inspectorate stating: the identity of the recipient, the nature of the offense pardoned, the grounds for the grant, and any relevant circumstances the executive considered. The EI reviews the report for factual accuracy and completeness within 14 days and publishes its findings to the National Record System. The reviewing chamber then has 45 days from the date of EI publication to vote to disapprove the grant by simple majority of those present and voting. If no disapproval vote is held within the 45-day period, the grant is deemed approved and takes full effect. If the reviewing chamber votes to disapprove by simple majority within the 45-day period, the grant is void and the original sentence or legal status is reinstated. Where a grant is voided by disapproval, the executive may not resubmit clemency for the same recipient for one year from the date of the disapproval vote. The EI pre-grant factual background report required under §2.1.g and §2.2.f is distinct from the executive's post-grant explanatory report required by this provision — both are published to the National Record System and together form the complete clemency record for any grant. The reviewing chamber's 45-day period begins from the date of EI publication.</w:t>
       </w:r>
     </w:p>
     <w:p>
@@ -4765,28 +4739,22 @@
     </w:p>
     <w:p>
       <w:pPr>
-        <w:spacing w:after="60" w:before="60" w:line="280" w:lineRule="auto"/>
-        <w:jc w:val="both"/>
-      </w:pPr>
-      <w:r>
-        <w:rPr>
-          <w:rFonts w:ascii="Times New Roman" w:cs="Times New Roman" w:eastAsia="Times New Roman" w:hAnsi="Times New Roman"/>
-          <w:b/>
-          <w:bCs/>
-          <w:color w:val="1B2A4A"/>
-          <w:sz w:val="22"/>
-          <w:szCs w:val="22"/>
-        </w:rPr>
-        <w:t xml:space="preserve">The Triad: </w:t>
-      </w:r>
-      <w:r>
-        <w:rPr>
-          <w:rFonts w:ascii="Times New Roman" w:cs="Times New Roman" w:eastAsia="Times New Roman" w:hAnsi="Times New Roman"/>
-          <w:color w:val="000000"/>
-          <w:sz w:val="22"/>
-          <w:szCs w:val="22"/>
-        </w:rPr>
-        <w:t xml:space="preserve">Each open Supreme Court seat is filled through a three-party nomination process. The three Triad nominators are the Senate, the Prime Minister, and the President, each submitting one candidate per vacancy from the Qualified Jurist Registry maintained by the Judicial Inspectorate. All three nominations must be submitted before the citizen election proceeds. This three-party structure — Senate, PM, and President — is referred to as the Triad throughout this Constitution. The Senate replaces the House as a Triad nominator because the Senate's closer institutional relationship with the President — through treaty ratification, judicial confirmations, and constitutional violation trials — produces genuinely distinct institutional perspective from both the PM and the President, while the House's nomination would effectively double the PM's voice given the PM's confidence relationship with the House.</w:t>
+        <w:spacing w:before="60" w:after="60" w:line="280" w:lineRule="auto"/>
+        <w:jc w:val="both"/>
+      </w:pPr>
+      <w:r>
+        <w:rPr>
+          <w:b/>
+          <w:sz w:val="22"/>
+          <w:color w:val="1B2A4A"/>
+        </w:rPr>
+        <w:t xml:space="preserve">Open-Candidacy Judicial Selection: </w:t>
+      </w:r>
+      <w:r>
+        <w:rPr>
+          <w:sz w:val="22"/>
+        </w:rPr>
+        <w:t xml:space="preserve">Each open Supreme Court seat is filled through an open-candidacy election process. Any citizen on the Qualified Jurist Registry maintained by the Judicial Inspectorate may register as a candidate. A Judicial Selection Board publishes an advisory assessment of registered candidates. Citizens elect justices by national Ranked Choice Vote. No political branch nominates or controls access to the ballot — the Registry is the eligibility filter, the Board is the expert voice, and the electorate makes the final determination.</w:t>
       </w:r>
     </w:p>
     <w:p>
@@ -4806,123 +4774,119 @@
     </w:p>
     <w:p>
       <w:pPr>
-        <w:spacing w:after="60" w:before="60" w:line="280" w:lineRule="auto"/>
-        <w:jc w:val="both"/>
-      </w:pPr>
-      <w:r>
-        <w:rPr>
-          <w:rFonts w:ascii="Times New Roman" w:cs="Times New Roman" w:eastAsia="Times New Roman" w:hAnsi="Times New Roman"/>
-          <w:b/>
-          <w:bCs/>
-          <w:color w:val="1B2A4A"/>
-          <w:sz w:val="22"/>
-          <w:szCs w:val="22"/>
-        </w:rPr>
-        <w:t xml:space="preserve">4.2.a Triad Nomination: </w:t>
-      </w:r>
-      <w:r>
-        <w:rPr>
-          <w:rFonts w:ascii="Times New Roman" w:cs="Times New Roman" w:eastAsia="Times New Roman" w:hAnsi="Times New Roman"/>
-          <w:color w:val="000000"/>
-          <w:sz w:val="22"/>
-          <w:szCs w:val="22"/>
-        </w:rPr>
-        <w:t xml:space="preserve">The Senate, the PM, and the President each nominate one candidate per open seat from the Qualified Jurist Registry. The Judicial Inspectorate maintains the Registry and certifies that each nominee meets the eligibility criteria of §8.4.a before the public election proceeds. All three nominations must be submitted and certified before any public election is scheduled. A Triad nominator who fails to submit a nomination within the Legislature-defined statutory period commits a constitutional dereliction, published to the National Record System; the remaining two nominees proceed to the public election without the missing nomination. No separate Senate eligibility confirmation vote is required — the Judicial Inspectorate's Registry certification is the sole eligibility filter. The Electoral Commission administers all elections including those for Supreme Court seats and may not exclude any Triad-nominated and Registry-certified candidate from the ballot.</w:t>
-      </w:r>
-    </w:p>
-    <w:p>
-      <w:pPr>
-        <w:spacing w:after="60" w:before="60" w:line="280" w:lineRule="auto"/>
-        <w:jc w:val="both"/>
-      </w:pPr>
-      <w:r>
-        <w:rPr>
-          <w:rFonts w:ascii="Times New Roman" w:cs="Times New Roman" w:eastAsia="Times New Roman" w:hAnsi="Times New Roman"/>
-          <w:b/>
-          <w:bCs/>
-          <w:color w:val="1B2A4A"/>
-          <w:sz w:val="22"/>
-          <w:szCs w:val="22"/>
-        </w:rPr>
-        <w:t xml:space="preserve">4.2.b Mid-Term Vacancy Process: </w:t>
-      </w:r>
-      <w:r>
-        <w:rPr>
-          <w:rFonts w:ascii="Times New Roman" w:cs="Times New Roman" w:eastAsia="Times New Roman" w:hAnsi="Times New Roman"/>
-          <w:color w:val="000000"/>
-          <w:sz w:val="22"/>
-          <w:szCs w:val="22"/>
-        </w:rPr>
-        <w:t xml:space="preserve">Where a Supreme Court seat becomes vacant mid-term through death, resignation, removal, or expulsion, a special election is held within 90 days. The President and PM each nominate one candidate from the Qualified Jurist Registry within a Legislature-defined period. The Senate has 90 days from the date of vacancy to nominate a third candidate from the Registry. If the Senate nominates within 90 days, all three candidates proceed to the public special election. If the Senate fails to nominate within 90 days, the President's and PM's two nominees proceed to a head-to-head public special election without a Senate nominee — the Senate's failure to nominate is published to the National Record System and is the Senate's constitutional consequence. The replacement justice serves only the remainder of the original term, not a new 12-year term. All other Triad nomination and Registry certification requirements of §4.2.a apply to mid-term vacancies.</w:t>
-      </w:r>
-    </w:p>
-    <w:p>
-      <w:pPr>
-        <w:spacing w:after="60" w:before="60" w:line="280" w:lineRule="auto"/>
-        <w:jc w:val="both"/>
-      </w:pPr>
-      <w:r>
-        <w:rPr>
-          <w:rFonts w:ascii="Times New Roman" w:cs="Times New Roman" w:eastAsia="Times New Roman" w:hAnsi="Times New Roman"/>
-          <w:b/>
-          <w:bCs/>
-          <w:color w:val="1B2A4A"/>
-          <w:sz w:val="22"/>
-          <w:szCs w:val="22"/>
-        </w:rPr>
-        <w:t xml:space="preserve">4.2.c Judicial Inspectorate Vetting: </w:t>
-      </w:r>
-      <w:r>
-        <w:rPr>
-          <w:rFonts w:ascii="Times New Roman" w:cs="Times New Roman" w:eastAsia="Times New Roman" w:hAnsi="Times New Roman"/>
-          <w:color w:val="000000"/>
-          <w:sz w:val="22"/>
-          <w:szCs w:val="22"/>
-        </w:rPr>
-        <w:t xml:space="preserve">Before any Triad nomination may proceed to the public election, the Judicial Inspectorate vets each nominee against the Qualified Jurist Registry criteria. The nominee's Registry registration record — submitted at the time of Registry admission — serves as the disclosure record for vetting purposes. The JI does not generate a new independent assessment; it confirms that the nominee remains in the Registry, that no disqualifying change in circumstances has occurred since Registry admission, and that the specific eligibility criteria continue to be met. A nominee who fails vetting may not proceed to the public election. The nominating Triad member whose nominee fails vetting must submit a replacement nominee within a Legislature-defined statutory period. Any nominee may petition the Supreme Court within 14 days of a vetting determination to challenge it on technical grounds; the nominee continues to be listed as pending during the review period. All vetting determinations are published to the National Record System.</w:t>
-      </w:r>
-    </w:p>
-    <w:p>
-      <w:pPr>
-        <w:spacing w:after="60" w:before="60" w:line="280" w:lineRule="auto"/>
-        <w:jc w:val="both"/>
-      </w:pPr>
-      <w:r>
-        <w:rPr>
-          <w:rFonts w:ascii="Times New Roman" w:cs="Times New Roman" w:eastAsia="Times New Roman" w:hAnsi="Times New Roman"/>
-          <w:b/>
-          <w:bCs/>
-          <w:color w:val="1B2A4A"/>
-          <w:sz w:val="22"/>
-          <w:szCs w:val="22"/>
+        <w:spacing w:before="60" w:after="60" w:line="280" w:lineRule="auto"/>
+        <w:jc w:val="both"/>
+      </w:pPr>
+      <w:r>
+        <w:rPr>
+          <w:b/>
+          <w:sz w:val="22"/>
+          <w:color w:val="1B2A4A"/>
+        </w:rPr>
+        <w:t xml:space="preserve">4.2.a Candidate Registration: </w:t>
+      </w:r>
+      <w:r>
+        <w:rPr>
+          <w:sz w:val="22"/>
+        </w:rPr>
+        <w:t xml:space="preserve">Any citizen whose name appears on the Judicial Inspectorate's Qualified Jurist Registry may register as a candidate for an open Supreme Court seat by filing a complete disclosure record with the Executive Inspectorate. The disclosure record must include: full professional history, all judicial or legal appointments held, any financial interests that could affect impartiality, and confirmation of continued Registry eligibility. The EI reviews each disclosure record for factual accuracy and completeness within 14 days of filing and publishes its findings to the National Record System. A candidate whose disclosure record contains a material inaccuracy or who no longer meets Registry criteria is removed from the ballot; the EI publishes the grounds. All other registered candidates proceed to JI certification and the public election. The Electoral Commission administers all Supreme Court elections and may not exclude any EI-reviewed, JI-certified candidate from the ballot.</w:t>
+      </w:r>
+    </w:p>
+    <w:p>
+      <w:pPr>
+        <w:spacing w:before="60" w:after="60" w:line="280" w:lineRule="auto"/>
+        <w:jc w:val="both"/>
+      </w:pPr>
+      <w:r>
+        <w:rPr>
+          <w:b/>
+          <w:sz w:val="22"/>
+          <w:color w:val="1B2A4A"/>
+        </w:rPr>
+        <w:t xml:space="preserve">4.2.b Judicial Selection Board: </w:t>
+      </w:r>
+      <w:r>
+        <w:rPr>
+          <w:sz w:val="22"/>
+        </w:rPr>
+        <w:t xml:space="preserve">A Judicial Selection Board publishes an advisory assessment of all registered candidates before each Supreme Court election. The Board consists of five members selected by lottery from inferior court judges who have served at least ten continuous years on the bench and who are not currently candidates for the open seat. No political branch appoints Board members — the lottery is administered by the Judicial Inspectorate from among all eligible judges. Board members serve for the duration of one selection cycle, from candidate registration through election certification. The Board assesses each candidate's judicial record, demonstrated legal reasoning, and professional independence as relevant to the Supreme Court's constitutional mandate. The assessment is advisory — the Board has no authority to remove candidates from the ballot and makes no endorsement. The full assessment is published to the National Record System no later than 60 days before the election and is publicly accessible at no cost.</w:t>
+      </w:r>
+    </w:p>
+    <w:p>
+      <w:pPr>
+        <w:spacing w:before="60" w:after="60" w:line="280" w:lineRule="auto"/>
+        <w:jc w:val="both"/>
+      </w:pPr>
+      <w:r>
+        <w:rPr>
+          <w:b/>
+          <w:sz w:val="22"/>
+          <w:color w:val="1B2A4A"/>
+        </w:rPr>
+        <w:t xml:space="preserve">4.2.c Judicial Inspectorate Certification: </w:t>
+      </w:r>
+      <w:r>
+        <w:rPr>
+          <w:sz w:val="22"/>
+        </w:rPr>
+        <w:t xml:space="preserve">Before any candidate may appear on the ballot, the Judicial Inspectorate confirms that the candidate remains on the Qualified Jurist Registry, that no disqualifying change in circumstances has occurred since Registry admission, and that the specific eligibility criteria of §8.4.a continue to be met. The JI does not conduct a new independent assessment — it confirms Registry status. Candidates who fail JI certification may not proceed to the public election; the JI publishes the grounds for any certification refusal to the National Record System. A candidate who disputes a certification refusal may challenge it before an Appellate Court within 14 days; the candidate remains listed as pending during that review period. All certification determinations are published to the National Record System.</w:t>
+      </w:r>
+    </w:p>
+    <w:p>
+      <w:pPr>
+        <w:spacing w:before="60" w:after="60" w:line="280" w:lineRule="auto"/>
+        <w:jc w:val="both"/>
+      </w:pPr>
+      <w:r>
+        <w:rPr>
+          <w:b/>
+          <w:sz w:val="22"/>
+          <w:color w:val="1B2A4A"/>
         </w:rPr>
         <w:t xml:space="preserve">4.2.d Public Election: </w:t>
       </w:r>
       <w:r>
         <w:rPr>
-          <w:rFonts w:ascii="Times New Roman" w:cs="Times New Roman" w:eastAsia="Times New Roman" w:hAnsi="Times New Roman"/>
-          <w:color w:val="000000"/>
-          <w:sz w:val="22"/>
-          <w:szCs w:val="22"/>
-        </w:rPr>
-        <w:t xml:space="preserve">Following Judicial Inspectorate vetting, all certified nominees are placed on the ballot for a national direct election by Ranked Choice Voting on the next National Election Day, or by special election within 90 days for mid-term vacancies under §4.2.b. The winner is the nominee who achieves a national RCV majority. The Electoral Commission administers the election and certifies the result to the National Record System. No institution may remove a certified nominee from the ballot after JI vetting is complete. The elected justice takes office upon taking the Official Oath, which is recorded on the National Record System within 24 hours of administration.</w:t>
-      </w:r>
-    </w:p>
-    <w:p>
-      <w:pPr>
-        <w:spacing w:after="60" w:before="60" w:line="280" w:lineRule="auto"/>
-        <w:jc w:val="both"/>
-      </w:pPr>
-      <w:r>
-        <w:rPr>
-          <w:rFonts w:ascii="Times New Roman" w:cs="Times New Roman" w:eastAsia="Times New Roman" w:hAnsi="Times New Roman"/>
-          <w:b/>
-          <w:bCs/>
-          <w:color w:val="1B2A4A"/>
-          <w:sz w:val="22"/>
-          <w:szCs w:val="22"/>
-        </w:rPr>
-        <w:t xml:space="preserve">4.2.e Emergency Panel for Tier 1 Scope Challenges: </w:t>
+          <w:sz w:val="22"/>
+        </w:rPr>
+        <w:t xml:space="preserve">Following JI certification, all certified candidates are placed on the ballot for a national direct election by Ranked Choice Voting on the next National Election Day, or by special election within 90 days for mid-term vacancies under §4.2.e. The winner is the candidate who achieves a national RCV majority among all certified candidates. Where a special election produces no RCV majority on first count, the standard RCV elimination process continues until one candidate holds a majority of active ballots. The Electoral Commission administers the election and certifies the result to the National Record System. The elected justice takes office upon taking the Official Oath, which is recorded on the National Record System within 24 hours of administration.</w:t>
+      </w:r>
+    </w:p>
+    <w:p>
+      <w:pPr>
+        <w:spacing w:before="60" w:after="60" w:line="280" w:lineRule="auto"/>
+        <w:jc w:val="both"/>
+      </w:pPr>
+      <w:r>
+        <w:rPr>
+          <w:b/>
+          <w:sz w:val="22"/>
+          <w:color w:val="1B2A4A"/>
+        </w:rPr>
+        <w:t xml:space="preserve">4.2.e Mid-Term Vacancies: </w:t>
+      </w:r>
+      <w:r>
+        <w:rPr>
+          <w:sz w:val="22"/>
+        </w:rPr>
+        <w:t xml:space="preserve">Where a Supreme Court seat becomes vacant mid-term through death, resignation, removal, or expulsion, a special election is held within 90 days. The full open-candidacy process of §4.2.a through §4.2.d applies, with timelines compressed to fit the 90-day window: candidate registration closes at day 14; EI review completes by day 28; Judicial Selection Board assessment is published by day 45; JI certification completes by day 55; election is held no later than day 90. The replacement justice serves only the remainder of the original 12-year term, not a new term. Where the compressed timeline cannot be met due to extraordinary circumstances, the Judicial Inspectorate may extend the window by no more than 30 days and publishes the extension and grounds to the National Record System.</w:t>
+      </w:r>
+    </w:p>
+    <w:p>
+      <w:pPr>
+        <w:spacing w:after="60" w:before="60" w:line="280" w:lineRule="auto"/>
+        <w:jc w:val="both"/>
+      </w:pPr>
+      <w:r>
+        <w:rPr>
+          <w:rFonts w:ascii="Times New Roman" w:cs="Times New Roman" w:eastAsia="Times New Roman" w:hAnsi="Times New Roman"/>
+          <w:b/>
+          <w:bCs/>
+          <w:color w:val="1B2A4A"/>
+          <w:sz w:val="22"/>
+          <w:szCs w:val="22"/>
+        </w:rPr>
+        <w:t xml:space="preserve">4.2.f Emergency Panel for Tier 1 Scope Challenges: </w:t>
       </w:r>
       <w:r>
         <w:rPr>
@@ -4948,7 +4912,7 @@
           <w:sz w:val="22"/>
           <w:szCs w:val="22"/>
         </w:rPr>
-        <w:t xml:space="preserve">4.2.f Vacancy Operating Rules: </w:t>
+        <w:t xml:space="preserve">4.2.g Vacancy Operating Rules: </w:t>
       </w:r>
       <w:r>
         <w:rPr>
@@ -4974,7 +4938,7 @@
           <w:sz w:val="22"/>
           <w:szCs w:val="22"/>
         </w:rPr>
-        <w:t xml:space="preserve">4.2.g Judicial Recusal: </w:t>
+        <w:t xml:space="preserve">4.2.h Judicial Recusal: </w:t>
       </w:r>
       <w:r>
         <w:rPr>
@@ -14143,7 +14107,7 @@
           <w:sz w:val="22"/>
           <w:szCs w:val="22"/>
         </w:rPr>
-        <w:t xml:space="preserve">The first National Election Day is held. Supreme Court justices are elected simultaneously through the Triad process. The Electoral Commission holds its inaugural elections. Phase 3 ends when the first Legislature is sworn in and the first President and Prime Minister take office.</w:t>
+        <w:t>The first National Election Day is held. Supreme Court justices are elected simultaneously through the open-candidacy judicial election process. The Electoral Commission holds its inaugural elections. Phase 3 ends when the first Legislature is sworn in and the first President and Prime Minister take office.</w:t>
       </w:r>
     </w:p>
     <w:p>

</xml_diff>